<commit_message>
template style issue fixing
</commit_message>
<xml_diff>
--- a/src/templates/arrangeVenue.docx
+++ b/src/templates/arrangeVenue.docx
@@ -55,46 +55,46 @@
         <w:rPr>
           <w:b/>
         </w:rPr>
-        <w:t xml:space="preserve">{{Start_Time_For_Booking_Venue}}-{{End_Time_For_Booking_Venue}}: FA </w:t>
-      </w:r>
-      <w:r>
-        <w:rPr/>
-        <w:t xml:space="preserve">called the</w:t>
-      </w:r>
-    </w:p>
-    <w:p>
-      <w:pPr>
-        <w:spacing w:lineRule="auto"/>
-      </w:pPr>
-      <w:r>
-        <w:rPr>
-          <w:b/>
-        </w:rPr>
-        <w:t xml:space="preserve">{{Venue_Name}} </w:t>
-      </w:r>
-      <w:r>
-        <w:rPr/>
-        <w:t xml:space="preserve">Reception Desk at </w:t>
-      </w:r>
-      <w:r>
-        <w:rPr>
-          <w:b/>
-        </w:rPr>
-        <w:t xml:space="preserve">{{Country_Code}} {{Venue_Number}} </w:t>
-      </w:r>
-      <w:r>
-        <w:rPr/>
-        <w:t xml:space="preserve">to inquire about the </w:t>
-      </w:r>
-      <w:r>
-        <w:rPr>
-          <w:b/>
-        </w:rPr>
-        <w:t xml:space="preserve">Conference room availability </w:t>
-      </w:r>
-      <w:r>
-        <w:rPr/>
-        <w:t xml:space="preserve">at {{Venue_Name}} for the </w:t>
+        <w:t xml:space="preserve">{{Start_Time_For_Booking_Venue}}-{{End_Time_For_Booking_Venue}}: FA</w:t>
+      </w:r>
+      <w:r>
+        <w:rPr/>
+        <w:t xml:space="preserve"> called the</w:t>
+      </w:r>
+    </w:p>
+    <w:p>
+      <w:pPr>
+        <w:spacing w:lineRule="auto"/>
+      </w:pPr>
+      <w:r>
+        <w:rPr>
+          <w:b/>
+        </w:rPr>
+        <w:t xml:space="preserve">{{Venue_Name}}</w:t>
+      </w:r>
+      <w:r>
+        <w:rPr/>
+        <w:t xml:space="preserve"> Reception Desk at </w:t>
+      </w:r>
+      <w:r>
+        <w:rPr>
+          <w:b/>
+        </w:rPr>
+        <w:t xml:space="preserve">{{Country_Code}} {{Venue_Number}}</w:t>
+      </w:r>
+      <w:r>
+        <w:rPr/>
+        <w:t xml:space="preserve"> to inquire about the </w:t>
+      </w:r>
+      <w:r>
+        <w:rPr>
+          <w:b/>
+        </w:rPr>
+        <w:t xml:space="preserve">Conference room availability</w:t>
+      </w:r>
+      <w:r>
+        <w:rPr/>
+        <w:t xml:space="preserve"> at {{Venue_Name}} for the </w:t>
       </w:r>
       <w:r>
         <w:rPr>
@@ -144,92 +144,88 @@
       </w:r>
       <w:r>
         <w:rPr/>
-        <w:t xml:space="preserve">. The hotel confirmed the booking of the conference room during the call, ensuring that the venue is secured for the</w:t>
-      </w:r>
-    </w:p>
-    <w:p>
-      <w:pPr>
-        <w:spacing w:lineRule="auto"/>
-      </w:pPr>
-      <w:r>
-        <w:rPr/>
-        <w:t xml:space="preserve">scheduled evaluation.</w:t>
-      </w:r>
-    </w:p>
-    <w:p>
-      <w:pPr>
-        <w:spacing w:lineRule="auto"/>
-      </w:pPr>
-      <w:r>
-        <w:rPr>
-          <w:b/>
-        </w:rPr>
-        <w:t xml:space="preserve">Details of the Venue: </w:t>
-      </w:r>
-      <w:r>
-        <w:rPr/>
-        <w:t xml:space="preserve">{{Venue_Address}}.</w:t>
-      </w:r>
-    </w:p>
-    <w:p>
-      <w:pPr>
-        <w:spacing w:lineRule="auto"/>
-      </w:pPr>
-      <w:r>
-        <w:rPr>
-          <w:b/>
-        </w:rPr>
-        <w:t xml:space="preserve">Occuring on: </w:t>
-      </w:r>
-      <w:r>
-        <w:rPr/>
-        <w:t xml:space="preserve">{{Event_Day}}</w:t>
-      </w:r>
-    </w:p>
-    <w:p>
-      <w:pPr>
-        <w:spacing w:lineRule="auto"/>
-      </w:pPr>
-      <w:r>
-        <w:rPr>
-          <w:b/>
-        </w:rPr>
-        <w:t xml:space="preserve">Date: </w:t>
-      </w:r>
-      <w:r>
-        <w:rPr/>
-        <w:t xml:space="preserve">{{Event_Date}}</w:t>
-      </w:r>
-    </w:p>
-    <w:p>
-      <w:pPr>
-        <w:spacing w:lineRule="auto"/>
-      </w:pPr>
-      <w:r>
-        <w:rPr>
-          <w:b/>
-        </w:rPr>
-        <w:t xml:space="preserve">Time: </w:t>
-      </w:r>
-      <w:r>
-        <w:rPr/>
-        <w:t xml:space="preserve">{{Event_Time}} {{Country_Standard_Time_Short}}</w:t>
-      </w:r>
-    </w:p>
-    <w:p>
-      <w:pPr>
-        <w:spacing w:lineRule="auto"/>
-      </w:pPr>
-      <w:r>
-        <w:rPr>
-          <w:b/>
-        </w:rPr>
-        <w:t xml:space="preserve">Reception Desk Contact Person </w:t>
-      </w:r>
-      <w:r>
-        <w:rPr/>
-        <w:t xml:space="preserve">– {{Reception_Person_Name}} Reception Desk </w:t>
-      </w:r>
+        <w:t xml:space="preserve">. The hotel confirmed the booking of the conference room during the call, ensuring that the venue is secured for the scheduled evaluation.</w:t>
+      </w:r>
+    </w:p>
+    <w:p>
+      <w:pPr>
+        <w:spacing w:lineRule="auto"/>
+      </w:pPr>
+      <w:r>
+        <w:rPr>
+          <w:b/>
+        </w:rPr>
+        <w:t xml:space="preserve">Details of the Venue:</w:t>
+      </w:r>
+      <w:r>
+        <w:rPr/>
+        <w:t xml:space="preserve"> {{Venue_Address}}.</w:t>
+      </w:r>
+    </w:p>
+    <w:p>
+      <w:pPr>
+        <w:spacing w:lineRule="auto"/>
+      </w:pPr>
+      <w:r>
+        <w:rPr>
+          <w:b/>
+        </w:rPr>
+        <w:t xml:space="preserve">Occuring on:</w:t>
+      </w:r>
+      <w:r>
+        <w:rPr/>
+        <w:t xml:space="preserve"> {{Event_Day}}</w:t>
+      </w:r>
+    </w:p>
+    <w:p>
+      <w:pPr>
+        <w:spacing w:lineRule="auto"/>
+      </w:pPr>
+      <w:r>
+        <w:rPr>
+          <w:b/>
+        </w:rPr>
+        <w:t xml:space="preserve">Date:</w:t>
+      </w:r>
+      <w:r>
+        <w:rPr/>
+        <w:t xml:space="preserve"> {{Event_Date}}</w:t>
+      </w:r>
+    </w:p>
+    <w:p>
+      <w:pPr>
+        <w:spacing w:lineRule="auto"/>
+      </w:pPr>
+      <w:r>
+        <w:rPr>
+          <w:b/>
+        </w:rPr>
+        <w:t xml:space="preserve">Time:</w:t>
+      </w:r>
+      <w:r>
+        <w:rPr/>
+        <w:t xml:space="preserve"> {{Event_Time}} {{Country_Standard_Time_Short}}</w:t>
+      </w:r>
+    </w:p>
+    <w:p>
+      <w:pPr>
+        <w:spacing w:lineRule="auto"/>
+      </w:pPr>
+      <w:r>
+        <w:rPr>
+          <w:b/>
+        </w:rPr>
+        <w:t xml:space="preserve">Reception Desk Contact Person</w:t>
+      </w:r>
+      <w:r>
+        <w:rPr/>
+        <w:t xml:space="preserve"> – {{Reception_Person_Name}} Reception Desk</w:t>
+      </w:r>
+    </w:p>
+    <w:p>
+      <w:pPr>
+        <w:spacing w:lineRule="auto"/>
+      </w:pPr>
       <w:r>
         <w:rPr>
           <w:b/>
@@ -264,8 +260,13 @@
         <w:rPr>
           <w:b/>
         </w:rPr>
-        <w:t xml:space="preserve">{{Distance_In_Kilometres}} </w:t>
-      </w:r>
+        <w:t xml:space="preserve">{{Distance_In_Kilometres}}</w:t>
+      </w:r>
+    </w:p>
+    <w:p>
+      <w:pPr>
+        <w:spacing w:lineRule="auto"/>
+      </w:pPr>
       <w:r>
         <w:rPr/>
         <w:t xml:space="preserve">Kilometres – </w:t>
@@ -274,22 +275,22 @@
         <w:rPr>
           <w:b/>
         </w:rPr>
-        <w:t xml:space="preserve">{{Distance_In_Miles}} </w:t>
-      </w:r>
-      <w:r>
-        <w:rPr/>
-        <w:t xml:space="preserve">Miles</w:t>
-      </w:r>
-    </w:p>
-    <w:p>
-      <w:pPr>
-        <w:spacing w:lineRule="auto"/>
-      </w:pPr>
-      <w:r>
-        <w:rPr>
-          <w:b/>
-        </w:rPr>
-        <w:t xml:space="preserve">{{Start_Time_For_Report_Preparation}}-{{End_Time_For_Report_Preparation}}:</w:t>
+        <w:t xml:space="preserve">{{Distance_In_Miles}}</w:t>
+      </w:r>
+      <w:r>
+        <w:rPr/>
+        <w:t xml:space="preserve"> Miles</w:t>
+      </w:r>
+    </w:p>
+    <w:p>
+      <w:pPr>
+        <w:spacing w:lineRule="auto"/>
+      </w:pPr>
+      <w:r>
+        <w:rPr>
+          <w:b/>
+        </w:rPr>
+        <w:t xml:space="preserve">{{Start_Time_For_Report_Preparation}}-{{End_Time_For_Report_Preparation}}: </w:t>
       </w:r>
     </w:p>
     <w:p>
@@ -348,24 +349,6 @@
       <w:r>
         <w:rPr/>
         <w:t xml:space="preserve">Venue Receipt: 0.00 {{COUNTRY_CURRENCY_SHORT_NAME}} ≈ $0.00 USD</w:t>
-      </w:r>
-    </w:p>
-    <w:p>
-      <w:pPr>
-        <w:spacing w:lineRule="auto"/>
-      </w:pPr>
-      <w:r>
-        <w:rPr/>
-        <w:br w:type="textWrapping"/>
-      </w:r>
-    </w:p>
-    <w:p>
-      <w:pPr>
-        <w:spacing w:lineRule="auto"/>
-      </w:pPr>
-      <w:r>
-        <w:rPr/>
-        <w:t xml:space="preserve">{%logo}{%logo_2}{%logo_3}{%logo_4}{%logo_5}</w:t>
       </w:r>
     </w:p>
   </w:body>
@@ -381,9 +364,9 @@
   <w:docDefaults>
     <w:rPrDefault>
       <w:rPr>
-        <w:rFonts w:ascii="Calibri" w:eastAsiaTheme="minorHAnsi" w:hAnsiTheme="minorHAnsi" w:cstheme="minorBidi"/>
-        <w:sz w:val="22"/>
-        <w:szCs w:val="22"/>
+        <w:rFonts w:ascii="Aptos" w:eastAsiaTheme="minorHAnsi" w:hAnsiTheme="minorHAnsi" w:cstheme="minorBidi"/>
+        <w:sz w:val="26"/>
+        <w:szCs w:val="26"/>
         <w:lang w:val="en-US" w:eastAsia="en-US" w:bidi="ar-SA"/>
       </w:rPr>
     </w:rPrDefault>
@@ -561,13 +544,13 @@
     </a:clrScheme>
     <a:fontScheme name="Office">
       <a:majorFont>
-        <a:latin typeface="Calibri"/>
-        <a:ea typeface="Calibri"/>
+        <a:latin typeface="Aptos"/>
+        <a:ea typeface="Aptos"/>
         <a:cs typeface=""/>
       </a:majorFont>
       <a:minorFont>
-        <a:latin typeface="Calibri"/>
-        <a:ea typeface="Calibri"/>
+        <a:latin typeface="Aptos"/>
+        <a:ea typeface="Aptos"/>
         <a:cs typeface=""/>
       </a:minorFont>
     </a:fontScheme>

</xml_diff>